<commit_message>
Tailor filing guidance for individual self-application
</commit_message>
<xml_diff>
--- a/docs/registration/word/03_登记申请信息草稿.docx
+++ b/docs/registration/word/03_登记申请信息草稿.docx
@@ -83,7 +83,7 @@
           <w:b w:val="0"/>
           <w:sz w:val="21"/>
         </w:rPr>
-        <w:t>。申请人身份、权属和日期等未确认事项保留为“待申请人填写”。</w:t>
+        <w:t>。申请人已确认以个人名义自行申请，申请人类型按自然人整理，不委托代理机构；姓名、权属和日期等未确认事项保留为“待申请人填写”。</w:t>
       </w:r>
     </w:p>
     <w:p>
@@ -1753,7 +1753,7 @@
                 <w:b w:val="0"/>
                 <w:sz w:val="18"/>
               </w:rPr>
-              <w:t>自然人姓名或单位完整登记名称，应与证明材料一致</w:t>
+              <w:t>填写本人身份证明上的完整姓名；个人名义申请仍须核实本人权利归属</w:t>
             </w:r>
           </w:p>
         </w:tc>
@@ -1796,7 +1796,7 @@
                 <w:b w:val="0"/>
                 <w:sz w:val="18"/>
               </w:rPr>
-              <w:t>待申请人填写</w:t>
+              <w:t>自然人（个人）</w:t>
             </w:r>
           </w:p>
         </w:tc>
@@ -1815,7 +1815,7 @@
                 <w:b w:val="0"/>
                 <w:sz w:val="18"/>
               </w:rPr>
-              <w:t>个人、法人或其他适用类型</w:t>
+              <w:t>已由申请人确认；按官方系统对应选项填写</w:t>
             </w:r>
           </w:p>
         </w:tc>
@@ -1839,7 +1839,69 @@
                 <w:b w:val="0"/>
                 <w:sz w:val="18"/>
               </w:rPr>
-              <w:t>国籍／注册地</w:t>
+              <w:t>办理方式</w:t>
+            </w:r>
+          </w:p>
+        </w:tc>
+        <w:tc>
+          <w:tcPr>
+            <w:tcW w:type="dxa" w:w="3175"/>
+            <w:vAlign w:val="center"/>
+          </w:tcPr>
+          <w:p>
+            <w:pPr>
+              <w:spacing w:before="60" w:after="60" w:line="280" w:lineRule="exact"/>
+            </w:pPr>
+            <w:r>
+              <w:rPr>
+                <w:rFonts w:ascii="Arial" w:hAnsi="Arial" w:eastAsia="Noto Sans CJK SC"/>
+                <w:b w:val="0"/>
+                <w:sz w:val="18"/>
+              </w:rPr>
+              <w:t>本人自行办理</w:t>
+            </w:r>
+          </w:p>
+        </w:tc>
+        <w:tc>
+          <w:tcPr>
+            <w:tcW w:type="dxa" w:w="3175"/>
+            <w:vAlign w:val="center"/>
+          </w:tcPr>
+          <w:p>
+            <w:pPr>
+              <w:spacing w:before="60" w:after="60" w:line="280" w:lineRule="exact"/>
+            </w:pPr>
+            <w:r>
+              <w:rPr>
+                <w:rFonts w:ascii="Arial" w:hAnsi="Arial" w:eastAsia="Noto Sans CJK SC"/>
+                <w:b w:val="0"/>
+                <w:sz w:val="18"/>
+              </w:rPr>
+              <w:t>已由申请人确认；本次不委托代理机构，不预设代理委托书</w:t>
+            </w:r>
+          </w:p>
+        </w:tc>
+      </w:tr>
+      <w:tr>
+        <w:trPr>
+          <w:cantSplit/>
+        </w:trPr>
+        <w:tc>
+          <w:tcPr>
+            <w:tcW w:type="dxa" w:w="3175"/>
+            <w:vAlign w:val="center"/>
+          </w:tcPr>
+          <w:p>
+            <w:pPr>
+              <w:spacing w:before="60" w:after="60" w:line="280" w:lineRule="exact"/>
+            </w:pPr>
+            <w:r>
+              <w:rPr>
+                <w:rFonts w:ascii="Arial" w:hAnsi="Arial" w:eastAsia="Noto Sans CJK SC"/>
+                <w:b w:val="0"/>
+                <w:sz w:val="18"/>
+              </w:rPr>
+              <w:t>国籍</w:t>
             </w:r>
           </w:p>
         </w:tc>
@@ -1877,7 +1939,7 @@
                 <w:b w:val="0"/>
                 <w:sz w:val="18"/>
               </w:rPr>
-              <w:t>按申请人身份证明或登记证明填写</w:t>
+              <w:t>按本人身份证明如实填写，不从申请地区推定国籍</w:t>
             </w:r>
           </w:p>
         </w:tc>
@@ -2267,7 +2329,7 @@
           <w:b w:val="0"/>
           <w:sz w:val="21"/>
         </w:rPr>
-        <w:t>本草稿不代填身份证号、统一社会信用代码、住址、电话、邮箱或签名。上述信息由申请人在官方办理环节按要求填写。代码仓库账号、Git 提交作者以及本地“审核员”显示名都不能替代著作权人确认。</w:t>
+        <w:t>本草稿不代填证件号码、住址、电话、邮箱或签名。上述信息由申请人在官方办理环节按要求填写；中国大陆自然人通常使用居民身份证，其他身份按官方对应要求准备。代码仓库账号、Git 提交作者以及本地“审核员”显示名都不能替代著作权人确认。个人自行申请不自动等于单独开发、原始取得或拥有全部权利。</w:t>
       </w:r>
     </w:p>
     <w:p>
@@ -2277,7 +2339,7 @@
           <w:b w:val="0"/>
           <w:sz w:val="21"/>
         </w:rPr>
-        <w:t>本项目代码与文档制作使用了 AI 辅助。申请人应核实实际参与的需求设计、代码理解与修改、验证等工作及所用第三方组件的权利来源，按事实填写开发和权属信息；不能仅凭持有代码或账号直接认定全部权利。若用于学校申请或成果认定，还需按本校规则确认使用条件和提交材料。相关开发过程记录可自行保存备查，不作为所有个人申请统一新增的必交附件。</w:t>
+        <w:t>本项目代码与文档制作使用了 AI 辅助。申请人应核实实际参与的需求设计、代码理解与修改、验证等工作及所用第三方组件的权利来源，按事实填写开发和权属信息；不能仅凭持有代码或账号直接认定全部权利。本次按个人自行申请整理，不将学校或单位内部审批材料列为本次通用必交件；已有职务、课题、委托或合作关系仍需核实。若日后用于毕业或校内成果认定，再另核本校规则。相关开发过程记录可自行保存备查，不作为所有个人申请统一新增的必交附件。</w:t>
       </w:r>
     </w:p>
     <w:p>

</xml_diff>

<commit_message>
Correct filing readiness and expand functional description
</commit_message>
<xml_diff>
--- a/docs/registration/word/03_登记申请信息草稿.docx
+++ b/docs/registration/word/03_登记申请信息草稿.docx
@@ -84,6 +84,94 @@
           <w:sz w:val="21"/>
         </w:rPr>
         <w:t>。申请人已确认以个人名义自行申请，申请人类型按自然人整理，不委托代理机构；姓名、权属和日期等未确认事项保留为“待申请人填写”。</w:t>
+      </w:r>
+    </w:p>
+    <w:p>
+      <w:pPr>
+        <w:pStyle w:val="Heading2"/>
+      </w:pPr>
+      <w:r>
+        <w:t>0. 先核对当前申报声明</w:t>
+      </w:r>
+    </w:p>
+    <w:p>
+      <w:r>
+        <w:rPr>
+          <w:rFonts w:ascii="Arial" w:hAnsi="Arial" w:eastAsia="Noto Sans CJK SC"/>
+          <w:b w:val="0"/>
+          <w:sz w:val="21"/>
+        </w:rPr>
+        <w:t>本项目代码及文档制作使用过 AI。2026-03-15 中国版权保护中心公告确认启用更新后的申请表；深圳市软件行业协会公布的新旧表对照列出未使用 AI 编写代码、撰写文档或生成申请材料的声明，并将主要功能字数列为 500—1300 字。官方公告本身未逐项刊出这些条文，本次也未取得申请人登录系统后生成的当前签章页。</w:t>
+      </w:r>
+    </w:p>
+    <w:p>
+      <w:r>
+        <w:rPr>
+          <w:rFonts w:ascii="Arial" w:hAnsi="Arial" w:eastAsia="Noto Sans CJK SC"/>
+          <w:b w:val="0"/>
+          <w:sz w:val="21"/>
+        </w:rPr>
+        <w:t>因此，应先核对官方系统当次要求，并向登记机构如实说明本项目 AI 参与范围、确认适用口径。若声明与实际开发经历不符，不应签署。现有材料不能表述为只补个人信息即可提交；润色、人工复核或检测分数变化不改变已使用 AI 的事实。下文功能描述仅为对应实际软件的填报参考，不表示本项目已获准按当前要求申请。</w:t>
+      </w:r>
+    </w:p>
+    <w:p>
+      <w:r>
+        <w:rPr>
+          <w:rFonts w:ascii="Arial" w:hAnsi="Arial" w:eastAsia="Noto Sans CJK SC"/>
+          <w:b w:val="0"/>
+          <w:sz w:val="21"/>
+        </w:rPr>
+        <w:t>来源：</w:t>
+      </w:r>
+      <w:r>
+        <w:rPr>
+          <w:rFonts w:ascii="Arial" w:hAnsi="Arial" w:eastAsia="Noto Sans CJK SC"/>
+          <w:b w:val="0"/>
+          <w:color w:val="176B60"/>
+          <w:sz w:val="21"/>
+        </w:rPr>
+        <w:t>中国版权保护中心公告（2026-03-15）</w:t>
+      </w:r>
+      <w:r>
+        <w:rPr>
+          <w:rFonts w:ascii="Arial" w:hAnsi="Arial" w:eastAsia="Noto Sans CJK SC"/>
+          <w:b w:val="0"/>
+          <w:sz w:val="17"/>
+        </w:rPr>
+        <w:t>（https:/​/​www.ccopyright.com.cn/​index.php?optionid=999&amp;method=view&amp;optionid=999&amp;auto_id=1524）</w:t>
+      </w:r>
+      <w:r>
+        <w:rPr>
+          <w:rFonts w:ascii="Arial" w:hAnsi="Arial" w:eastAsia="Noto Sans CJK SC"/>
+          <w:b w:val="0"/>
+          <w:sz w:val="21"/>
+        </w:rPr>
+        <w:t>；</w:t>
+      </w:r>
+      <w:r>
+        <w:rPr>
+          <w:rFonts w:ascii="Arial" w:hAnsi="Arial" w:eastAsia="Noto Sans CJK SC"/>
+          <w:b w:val="0"/>
+          <w:color w:val="176B60"/>
+          <w:sz w:val="21"/>
+        </w:rPr>
+        <w:t>深圳市软件行业协会的新旧表对照（2026-03-16）</w:t>
+      </w:r>
+      <w:r>
+        <w:rPr>
+          <w:rFonts w:ascii="Arial" w:hAnsi="Arial" w:eastAsia="Noto Sans CJK SC"/>
+          <w:b w:val="0"/>
+          <w:sz w:val="17"/>
+        </w:rPr>
+        <w:t>（https:/​/​www.ssia.org.cn/​page59?article_id=2588）</w:t>
+      </w:r>
+      <w:r>
+        <w:rPr>
+          <w:rFonts w:ascii="Arial" w:hAnsi="Arial" w:eastAsia="Noto Sans CJK SC"/>
+          <w:b w:val="0"/>
+          <w:sz w:val="21"/>
+        </w:rPr>
+        <w:t>。查阅日期：2026-10-26。</w:t>
       </w:r>
     </w:p>
     <w:p>
@@ -865,7 +953,7 @@
         <w:pStyle w:val="Heading2"/>
       </w:pPr>
       <w:r>
-        <w:t>2. 可直接复制的功能描述</w:t>
+        <w:t>2. 软件功能填报参考</w:t>
       </w:r>
     </w:p>
     <w:p>
@@ -875,7 +963,7 @@
           <w:b w:val="0"/>
           <w:sz w:val="21"/>
         </w:rPr>
-        <w:t>以下字数按 Python 字符数统计，包含标点、英文字母和数字。该字数仅用于控制草稿长度；录入时应以办理系统实际提示为准。</w:t>
+        <w:t>以下字数按 Python 字符数统计，包含标点、英文字母和数字。主要功能参考文本按上述新表对照的 500—1300 字范围准备；实际录入仍以官方系统当次字段和计数提示为准，并以第 0 节申报条件已核实为前提。</w:t>
       </w:r>
     </w:p>
     <w:p>
@@ -939,7 +1027,7 @@
           <w:b w:val="0"/>
           <w:sz w:val="21"/>
         </w:rPr>
-        <w:t>建立药品档案并导入纯文字PDF、DOCX、TXT或粘贴文本，保存版本日期、来源和原始文件；自动识别章节并支持人工校正，对比同一药品新旧版本的新增、删除及修改内容，提示数字、单位和重点章节变化；记录确认、忽略及复核意见，导出HTML、CSV、JSON报告，查询操作记录。</w:t>
+        <w:t>本软件用于药品说明书多版本资料的整理、文本差异核对和人工复核记录，面向药学资料整理、说明书审核及教学演示场景，将版本归档、章节比对、意见保存和报告导出组织在同一流程中。使用者可建立药品档案，填写名称、厂家、规格、批准文号及备注，在档案下分别导入旧版和新版说明书，记录版本名称、日期与资料来源。支持TXT、DOCX、纯文字且不含图片的PDF文件及粘贴文本；导入后保存原始文件、提取原文、文件SHA-256摘要和章节结构，供使用者查看原文、下载原件并核查输入内容。系统按标题规范化和明确的别名规则自动识别章节，保留重复标题及其出现次序；在版本尚未参与比对时，使用者可以人工添加、删除或修改章节，校正操作不改写原始文件与提取原文。创建比对时，程序检查所选版本是否属于同一药品、版本编号是否不同以及日期顺序是否符合要求，按规范化标题和同名章节出现次序配对，分别列出新增、删除和修改内容，并统计未变化章节。审核界面并列显示旧版与新版正文，突出字符增删，提示章节重排、重复标题和需人工核查的长章节。程序依据固定重点章节、数字序列及单位序列的变化设置关注标记，便于安排复核顺序；这些提示不进行剂量换算或医学语义判断，不构成临床风险评级或监管结论。每项变化初始为待复核，使用者可确认、忽略或恢复待复核，并填写审核意见；忽略操作要求填写原因。系统保存操作者显示名、处理时间和修订号，根据差异状态汇总任务进度；旧窗口提交的修订号与当前记录不一致时拒绝覆盖，提示重新核对。已被比对引用的版本章节禁止继续修改，更正资料时需导入新版本并另建比对，以保留原任务依据。使用者可按审核状态及关注级别筛选差异，在审核过程中或完成后导出HTML、CSV、JSON报告，报告反映导出时点的版本来源、变化内容和人工处理状态，并可查询近期档案建立、版本导入、章节校正、比对创建及审核更新等操作记录。软件采用本地浏览器界面、Python与FastAPI服务、SQLite数据库及本地附件目录，按单机单个可信操作者使用设计；依赖安装完成后，资料处理不依赖外部大模型服务。不提供OCR、多人账户认证、电子签名、处方生成或药品监管数据库联网核验，输入提取结果和复核结论均由使用者结合原始资料确认。</w:t>
       </w:r>
     </w:p>
     <w:p>
@@ -949,7 +1037,7 @@
           <w:b w:val="0"/>
           <w:sz w:val="21"/>
         </w:rPr>
-        <w:t>字符数：134。</w:t>
+        <w:t>字符数：923。</w:t>
       </w:r>
     </w:p>
     <w:p>

</xml_diff>